<commit_message>
Report: add stage-2 CFD results section and figures
- New section 7 (stage-2 CFD results): setup changes, performance vs
  meanline, work and angular-momentum checks, loss location and the
  averaging uncertainty, flow-field figures, y+ and limitations.
- report/figures/: stage-2 Post figures (relative Mach at three spans,
  absolute Mach, Cr at the impeller exit, tip-leakage streamlines,
  meridional plots, r·Cθ chart).
- docs/04: angular momentum through the diffuser, figure notes, y+.
- Blade loading left as a placeholder until the main blade and splitter
  are separated from the CSV.

Co-Authored-By: Claude Opus 5.5 <noreply@anthropic.com>
Claude-Session: https://claude.ai/code/session_016brbCcfiQXCWtL22x14yQo
</commit_message>
<xml_diff>
--- a/report/Turbocor_Compressor_Report_DRAFT.docx
+++ b/report/Turbocor_Compressor_Report_DRAFT.docx
@@ -91,7 +91,7 @@
           <w:sz w:val="20"/>
           <w:szCs w:val="20"/>
         </w:rPr>
-        <w:t xml:space="preserve">Status: draft. Covers the design basis, CAD model, CFD method and the first stage-1 CFD result. Design-point CFD, stage 2, the compressor map and structural analysis are still to come.</w:t>
+        <w:t xml:space="preserve">Status: draft. Covers the design basis, CAD model, CFD method, the first stage-1 CFD result and the stage-2 design-point CFD. The design-point stage-1 run, the compressor map and structural analysis are still to come.</w:t>
       </w:r>
     </w:p>
     <w:p>
@@ -7097,7 +7097,2236 @@
         <w:spacing w:after="160" w:before="360"/>
       </w:pPr>
       <w:r>
-        <w:t xml:space="preserve">7  Remaining work</w:t>
+        <w:t xml:space="preserve">7  Stage-2 CFD results</w:t>
+      </w:r>
+    </w:p>
+    <w:p>
+      <w:pPr>
+        <w:pStyle w:val="Heading2"/>
+        <w:spacing w:after="120" w:before="240"/>
+      </w:pPr>
+      <w:r>
+        <w:t xml:space="preserve">7.1  Setup changes from stage 1</w:t>
+      </w:r>
+    </w:p>
+    <w:p>
+      <w:pPr>
+        <w:spacing w:after="140" w:line="276"/>
+      </w:pPr>
+      <w:r>
+        <w:t xml:space="preserve">Stage 2 used the same single-passage approach with the stage-2 TurboGrid mesh (386,472 nodes, 358,685 hexahedra). The inlet was set to the meanline stage-1 exit state: total pressure 720.9 kPa absolute (120.9 kPa relative to a 600 kPa reference) and total temperature 305 K, with the design mass flow of 3.343 kg/s at the outlet. The run went to the 1000-iteration limit.</w:t>
+      </w:r>
+    </w:p>
+    <w:p>
+      <w:pPr>
+        <w:spacing w:after="140" w:line="276"/>
+      </w:pPr>
+      <w:r>
+        <w:t xml:space="preserve">Two setup problems were found and fixed on the way. Without table generation, the R-134a real-gas property table stops at about 1 MPa absolute; stage 2 reaches about 1.4 MPa, so the first attempt clipped the pressure from the first iteration, ran away and stopped with a floating-point overflow. The final run used a generated table from 1 kPa to 4 MPa and 240 K to 480 K (200 points per axis) and had no property clipping. Second, the post-processing expressions copied from the stage-1 project still added the 300 kPa stage-1 reference pressure instead of 600 kPa.</w:t>
+      </w:r>
+    </w:p>
+    <w:p>
+      <w:pPr>
+        <w:pStyle w:val="Heading2"/>
+        <w:spacing w:after="120" w:before="240"/>
+      </w:pPr>
+      <w:r>
+        <w:t xml:space="preserve">7.2  Overall performance</w:t>
+      </w:r>
+    </w:p>
+    <w:p>
+      <w:pPr>
+        <w:spacing w:after="80" w:before="200"/>
+      </w:pPr>
+      <w:r>
+        <w:rPr>
+          <w:b/>
+          <w:bCs/>
+          <w:sz w:val="20"/>
+          <w:szCs w:val="20"/>
+        </w:rPr>
+        <w:t xml:space="preserve">Table 10. Stage-2 performance: CFD (mass-averaged) vs meanline</w:t>
+      </w:r>
+    </w:p>
+    <w:tbl>
+      <w:tblPr>
+        <w:tblW w:type="dxa" w:w="9360"/>
+        <w:tblBorders>
+          <w:top w:val="single" w:color="auto" w:sz="4"/>
+          <w:left w:val="single" w:color="auto" w:sz="4"/>
+          <w:bottom w:val="single" w:color="auto" w:sz="4"/>
+          <w:right w:val="single" w:color="auto" w:sz="4"/>
+          <w:insideH w:val="single" w:color="auto" w:sz="4"/>
+          <w:insideV w:val="single" w:color="auto" w:sz="4"/>
+        </w:tblBorders>
+      </w:tblPr>
+      <w:tblGrid>
+        <w:gridCol w:w="4160"/>
+        <w:gridCol w:w="2600"/>
+        <w:gridCol w:w="2600"/>
+      </w:tblGrid>
+      <w:tr>
+        <w:trPr>
+          <w:tblHeader/>
+        </w:trPr>
+        <w:tc>
+          <w:tcPr>
+            <w:tcW w:type="dxa" w:w="4160"/>
+            <w:tcBorders>
+              <w:top w:val="single" w:color="BFC7CE" w:sz="4"/>
+              <w:left w:val="single" w:color="BFC7CE" w:sz="4"/>
+              <w:bottom w:val="single" w:color="BFC7CE" w:sz="4"/>
+              <w:right w:val="single" w:color="BFC7CE" w:sz="4"/>
+            </w:tcBorders>
+            <w:shd w:fill="DCE6EC" w:color="auto" w:val="clear"/>
+            <w:tcMar>
+              <w:top w:type="dxa" w:w="60"/>
+              <w:left w:type="dxa" w:w="100"/>
+              <w:bottom w:type="dxa" w:w="60"/>
+              <w:right w:type="dxa" w:w="100"/>
+            </w:tcMar>
+          </w:tcPr>
+          <w:p>
+            <w:r>
+              <w:rPr>
+                <w:b/>
+                <w:bCs/>
+                <w:sz w:val="20"/>
+                <w:szCs w:val="20"/>
+              </w:rPr>
+              <w:t xml:space="preserve">Quantity</w:t>
+            </w:r>
+          </w:p>
+        </w:tc>
+        <w:tc>
+          <w:tcPr>
+            <w:tcW w:type="dxa" w:w="2600"/>
+            <w:tcBorders>
+              <w:top w:val="single" w:color="BFC7CE" w:sz="4"/>
+              <w:left w:val="single" w:color="BFC7CE" w:sz="4"/>
+              <w:bottom w:val="single" w:color="BFC7CE" w:sz="4"/>
+              <w:right w:val="single" w:color="BFC7CE" w:sz="4"/>
+            </w:tcBorders>
+            <w:shd w:fill="DCE6EC" w:color="auto" w:val="clear"/>
+            <w:tcMar>
+              <w:top w:type="dxa" w:w="60"/>
+              <w:left w:type="dxa" w:w="100"/>
+              <w:bottom w:type="dxa" w:w="60"/>
+              <w:right w:type="dxa" w:w="100"/>
+            </w:tcMar>
+          </w:tcPr>
+          <w:p>
+            <w:r>
+              <w:rPr>
+                <w:b/>
+                <w:bCs/>
+                <w:sz w:val="20"/>
+                <w:szCs w:val="20"/>
+              </w:rPr>
+              <w:t xml:space="preserve">CFD</w:t>
+            </w:r>
+          </w:p>
+        </w:tc>
+        <w:tc>
+          <w:tcPr>
+            <w:tcW w:type="dxa" w:w="2600"/>
+            <w:tcBorders>
+              <w:top w:val="single" w:color="BFC7CE" w:sz="4"/>
+              <w:left w:val="single" w:color="BFC7CE" w:sz="4"/>
+              <w:bottom w:val="single" w:color="BFC7CE" w:sz="4"/>
+              <w:right w:val="single" w:color="BFC7CE" w:sz="4"/>
+            </w:tcBorders>
+            <w:shd w:fill="DCE6EC" w:color="auto" w:val="clear"/>
+            <w:tcMar>
+              <w:top w:type="dxa" w:w="60"/>
+              <w:left w:type="dxa" w:w="100"/>
+              <w:bottom w:type="dxa" w:w="60"/>
+              <w:right w:type="dxa" w:w="100"/>
+            </w:tcMar>
+          </w:tcPr>
+          <w:p>
+            <w:r>
+              <w:rPr>
+                <w:b/>
+                <w:bCs/>
+                <w:sz w:val="20"/>
+                <w:szCs w:val="20"/>
+              </w:rPr>
+              <w:t xml:space="preserve">Meanline</w:t>
+            </w:r>
+          </w:p>
+        </w:tc>
+      </w:tr>
+      <w:tr>
+        <w:tc>
+          <w:tcPr>
+            <w:tcW w:type="dxa" w:w="4160"/>
+            <w:tcBorders>
+              <w:top w:val="single" w:color="BFC7CE" w:sz="4"/>
+              <w:left w:val="single" w:color="BFC7CE" w:sz="4"/>
+              <w:bottom w:val="single" w:color="BFC7CE" w:sz="4"/>
+              <w:right w:val="single" w:color="BFC7CE" w:sz="4"/>
+            </w:tcBorders>
+            <w:tcMar>
+              <w:top w:type="dxa" w:w="60"/>
+              <w:left w:type="dxa" w:w="100"/>
+              <w:bottom w:type="dxa" w:w="60"/>
+              <w:right w:type="dxa" w:w="100"/>
+            </w:tcMar>
+          </w:tcPr>
+          <w:p>
+            <w:r>
+              <w:rPr>
+                <w:b w:val="false"/>
+                <w:bCs w:val="false"/>
+                <w:sz w:val="20"/>
+                <w:szCs w:val="20"/>
+              </w:rPr>
+              <w:t xml:space="preserve">Inlet / outlet total pressure (abs)</w:t>
+            </w:r>
+          </w:p>
+        </w:tc>
+        <w:tc>
+          <w:tcPr>
+            <w:tcW w:type="dxa" w:w="2600"/>
+            <w:tcBorders>
+              <w:top w:val="single" w:color="BFC7CE" w:sz="4"/>
+              <w:left w:val="single" w:color="BFC7CE" w:sz="4"/>
+              <w:bottom w:val="single" w:color="BFC7CE" w:sz="4"/>
+              <w:right w:val="single" w:color="BFC7CE" w:sz="4"/>
+            </w:tcBorders>
+            <w:tcMar>
+              <w:top w:type="dxa" w:w="60"/>
+              <w:left w:type="dxa" w:w="100"/>
+              <w:bottom w:type="dxa" w:w="60"/>
+              <w:right w:type="dxa" w:w="100"/>
+            </w:tcMar>
+          </w:tcPr>
+          <w:p>
+            <w:r>
+              <w:rPr>
+                <w:b w:val="false"/>
+                <w:bCs w:val="false"/>
+                <w:sz w:val="20"/>
+                <w:szCs w:val="20"/>
+              </w:rPr>
+              <w:t xml:space="preserve">720.6 / 1406 kPa</w:t>
+            </w:r>
+          </w:p>
+        </w:tc>
+        <w:tc>
+          <w:tcPr>
+            <w:tcW w:type="dxa" w:w="2600"/>
+            <w:tcBorders>
+              <w:top w:val="single" w:color="BFC7CE" w:sz="4"/>
+              <w:left w:val="single" w:color="BFC7CE" w:sz="4"/>
+              <w:bottom w:val="single" w:color="BFC7CE" w:sz="4"/>
+              <w:right w:val="single" w:color="BFC7CE" w:sz="4"/>
+            </w:tcBorders>
+            <w:tcMar>
+              <w:top w:type="dxa" w:w="60"/>
+              <w:left w:type="dxa" w:w="100"/>
+              <w:bottom w:type="dxa" w:w="60"/>
+              <w:right w:type="dxa" w:w="100"/>
+            </w:tcMar>
+          </w:tcPr>
+          <w:p>
+            <w:r>
+              <w:rPr>
+                <w:b w:val="false"/>
+                <w:bCs w:val="false"/>
+                <w:sz w:val="20"/>
+                <w:szCs w:val="20"/>
+              </w:rPr>
+              <w:t xml:space="preserve">720.9 / 1420.1 kPa</w:t>
+            </w:r>
+          </w:p>
+        </w:tc>
+      </w:tr>
+      <w:tr>
+        <w:tc>
+          <w:tcPr>
+            <w:tcW w:type="dxa" w:w="4160"/>
+            <w:tcBorders>
+              <w:top w:val="single" w:color="BFC7CE" w:sz="4"/>
+              <w:left w:val="single" w:color="BFC7CE" w:sz="4"/>
+              <w:bottom w:val="single" w:color="BFC7CE" w:sz="4"/>
+              <w:right w:val="single" w:color="BFC7CE" w:sz="4"/>
+            </w:tcBorders>
+            <w:tcMar>
+              <w:top w:type="dxa" w:w="60"/>
+              <w:left w:type="dxa" w:w="100"/>
+              <w:bottom w:type="dxa" w:w="60"/>
+              <w:right w:type="dxa" w:w="100"/>
+            </w:tcMar>
+          </w:tcPr>
+          <w:p>
+            <w:r>
+              <w:rPr>
+                <w:b w:val="false"/>
+                <w:bCs w:val="false"/>
+                <w:sz w:val="20"/>
+                <w:szCs w:val="20"/>
+              </w:rPr>
+              <w:t xml:space="preserve">Total pressure ratio</w:t>
+            </w:r>
+          </w:p>
+        </w:tc>
+        <w:tc>
+          <w:tcPr>
+            <w:tcW w:type="dxa" w:w="2600"/>
+            <w:tcBorders>
+              <w:top w:val="single" w:color="BFC7CE" w:sz="4"/>
+              <w:left w:val="single" w:color="BFC7CE" w:sz="4"/>
+              <w:bottom w:val="single" w:color="BFC7CE" w:sz="4"/>
+              <w:right w:val="single" w:color="BFC7CE" w:sz="4"/>
+            </w:tcBorders>
+            <w:tcMar>
+              <w:top w:type="dxa" w:w="60"/>
+              <w:left w:type="dxa" w:w="100"/>
+              <w:bottom w:type="dxa" w:w="60"/>
+              <w:right w:type="dxa" w:w="100"/>
+            </w:tcMar>
+          </w:tcPr>
+          <w:p>
+            <w:r>
+              <w:rPr>
+                <w:b w:val="false"/>
+                <w:bCs w:val="false"/>
+                <w:sz w:val="20"/>
+                <w:szCs w:val="20"/>
+              </w:rPr>
+              <w:t xml:space="preserve">1.951</w:t>
+            </w:r>
+          </w:p>
+        </w:tc>
+        <w:tc>
+          <w:tcPr>
+            <w:tcW w:type="dxa" w:w="2600"/>
+            <w:tcBorders>
+              <w:top w:val="single" w:color="BFC7CE" w:sz="4"/>
+              <w:left w:val="single" w:color="BFC7CE" w:sz="4"/>
+              <w:bottom w:val="single" w:color="BFC7CE" w:sz="4"/>
+              <w:right w:val="single" w:color="BFC7CE" w:sz="4"/>
+            </w:tcBorders>
+            <w:tcMar>
+              <w:top w:type="dxa" w:w="60"/>
+              <w:left w:type="dxa" w:w="100"/>
+              <w:bottom w:type="dxa" w:w="60"/>
+              <w:right w:type="dxa" w:w="100"/>
+            </w:tcMar>
+          </w:tcPr>
+          <w:p>
+            <w:r>
+              <w:rPr>
+                <w:b w:val="false"/>
+                <w:bCs w:val="false"/>
+                <w:sz w:val="20"/>
+                <w:szCs w:val="20"/>
+              </w:rPr>
+              <w:t xml:space="preserve">1.970</w:t>
+            </w:r>
+          </w:p>
+        </w:tc>
+      </w:tr>
+      <w:tr>
+        <w:tc>
+          <w:tcPr>
+            <w:tcW w:type="dxa" w:w="4160"/>
+            <w:tcBorders>
+              <w:top w:val="single" w:color="BFC7CE" w:sz="4"/>
+              <w:left w:val="single" w:color="BFC7CE" w:sz="4"/>
+              <w:bottom w:val="single" w:color="BFC7CE" w:sz="4"/>
+              <w:right w:val="single" w:color="BFC7CE" w:sz="4"/>
+            </w:tcBorders>
+            <w:tcMar>
+              <w:top w:type="dxa" w:w="60"/>
+              <w:left w:type="dxa" w:w="100"/>
+              <w:bottom w:type="dxa" w:w="60"/>
+              <w:right w:type="dxa" w:w="100"/>
+            </w:tcMar>
+          </w:tcPr>
+          <w:p>
+            <w:r>
+              <w:rPr>
+                <w:b w:val="false"/>
+                <w:bCs w:val="false"/>
+                <w:sz w:val="20"/>
+                <w:szCs w:val="20"/>
+              </w:rPr>
+              <w:t xml:space="preserve">Specific work Δh₀</w:t>
+            </w:r>
+          </w:p>
+        </w:tc>
+        <w:tc>
+          <w:tcPr>
+            <w:tcW w:type="dxa" w:w="2600"/>
+            <w:tcBorders>
+              <w:top w:val="single" w:color="BFC7CE" w:sz="4"/>
+              <w:left w:val="single" w:color="BFC7CE" w:sz="4"/>
+              <w:bottom w:val="single" w:color="BFC7CE" w:sz="4"/>
+              <w:right w:val="single" w:color="BFC7CE" w:sz="4"/>
+            </w:tcBorders>
+            <w:tcMar>
+              <w:top w:type="dxa" w:w="60"/>
+              <w:left w:type="dxa" w:w="100"/>
+              <w:bottom w:type="dxa" w:w="60"/>
+              <w:right w:type="dxa" w:w="100"/>
+            </w:tcMar>
+          </w:tcPr>
+          <w:p>
+            <w:r>
+              <w:rPr>
+                <w:b w:val="false"/>
+                <w:bCs w:val="false"/>
+                <w:sz w:val="20"/>
+                <w:szCs w:val="20"/>
+              </w:rPr>
+              <w:t xml:space="preserve">15.54 kJ/kg</w:t>
+            </w:r>
+          </w:p>
+        </w:tc>
+        <w:tc>
+          <w:tcPr>
+            <w:tcW w:type="dxa" w:w="2600"/>
+            <w:tcBorders>
+              <w:top w:val="single" w:color="BFC7CE" w:sz="4"/>
+              <w:left w:val="single" w:color="BFC7CE" w:sz="4"/>
+              <w:bottom w:val="single" w:color="BFC7CE" w:sz="4"/>
+              <w:right w:val="single" w:color="BFC7CE" w:sz="4"/>
+            </w:tcBorders>
+            <w:tcMar>
+              <w:top w:type="dxa" w:w="60"/>
+              <w:left w:type="dxa" w:w="100"/>
+              <w:bottom w:type="dxa" w:w="60"/>
+              <w:right w:type="dxa" w:w="100"/>
+            </w:tcMar>
+          </w:tcPr>
+          <w:p>
+            <w:r>
+              <w:rPr>
+                <w:b w:val="false"/>
+                <w:bCs w:val="false"/>
+                <w:sz w:val="20"/>
+                <w:szCs w:val="20"/>
+              </w:rPr>
+              <w:t xml:space="preserve">16.53 kJ/kg</w:t>
+            </w:r>
+          </w:p>
+        </w:tc>
+      </w:tr>
+      <w:tr>
+        <w:tc>
+          <w:tcPr>
+            <w:tcW w:type="dxa" w:w="4160"/>
+            <w:tcBorders>
+              <w:top w:val="single" w:color="BFC7CE" w:sz="4"/>
+              <w:left w:val="single" w:color="BFC7CE" w:sz="4"/>
+              <w:bottom w:val="single" w:color="BFC7CE" w:sz="4"/>
+              <w:right w:val="single" w:color="BFC7CE" w:sz="4"/>
+            </w:tcBorders>
+            <w:tcMar>
+              <w:top w:type="dxa" w:w="60"/>
+              <w:left w:type="dxa" w:w="100"/>
+              <w:bottom w:type="dxa" w:w="60"/>
+              <w:right w:type="dxa" w:w="100"/>
+            </w:tcMar>
+          </w:tcPr>
+          <w:p>
+            <w:r>
+              <w:rPr>
+                <w:b w:val="false"/>
+                <w:bCs w:val="false"/>
+                <w:sz w:val="20"/>
+                <w:szCs w:val="20"/>
+              </w:rPr>
+              <w:t xml:space="preserve">Outlet total temperature (real gas, from Δh₀)</w:t>
+            </w:r>
+          </w:p>
+        </w:tc>
+        <w:tc>
+          <w:tcPr>
+            <w:tcW w:type="dxa" w:w="2600"/>
+            <w:tcBorders>
+              <w:top w:val="single" w:color="BFC7CE" w:sz="4"/>
+              <w:left w:val="single" w:color="BFC7CE" w:sz="4"/>
+              <w:bottom w:val="single" w:color="BFC7CE" w:sz="4"/>
+              <w:right w:val="single" w:color="BFC7CE" w:sz="4"/>
+            </w:tcBorders>
+            <w:tcMar>
+              <w:top w:type="dxa" w:w="60"/>
+              <w:left w:type="dxa" w:w="100"/>
+              <w:bottom w:type="dxa" w:w="60"/>
+              <w:right w:type="dxa" w:w="100"/>
+            </w:tcMar>
+          </w:tcPr>
+          <w:p>
+            <w:r>
+              <w:rPr>
+                <w:b w:val="false"/>
+                <w:bCs w:val="false"/>
+                <w:sz w:val="20"/>
+                <w:szCs w:val="20"/>
+              </w:rPr>
+              <w:t xml:space="preserve">333.2 K</w:t>
+            </w:r>
+          </w:p>
+        </w:tc>
+        <w:tc>
+          <w:tcPr>
+            <w:tcW w:type="dxa" w:w="2600"/>
+            <w:tcBorders>
+              <w:top w:val="single" w:color="BFC7CE" w:sz="4"/>
+              <w:left w:val="single" w:color="BFC7CE" w:sz="4"/>
+              <w:bottom w:val="single" w:color="BFC7CE" w:sz="4"/>
+              <w:right w:val="single" w:color="BFC7CE" w:sz="4"/>
+            </w:tcBorders>
+            <w:tcMar>
+              <w:top w:type="dxa" w:w="60"/>
+              <w:left w:type="dxa" w:w="100"/>
+              <w:bottom w:type="dxa" w:w="60"/>
+              <w:right w:type="dxa" w:w="100"/>
+            </w:tcMar>
+          </w:tcPr>
+          <w:p>
+            <w:r>
+              <w:rPr>
+                <w:b w:val="false"/>
+                <w:bCs w:val="false"/>
+                <w:sz w:val="20"/>
+                <w:szCs w:val="20"/>
+              </w:rPr>
+              <w:t xml:space="preserve">333.3 K</w:t>
+            </w:r>
+          </w:p>
+        </w:tc>
+      </w:tr>
+      <w:tr>
+        <w:tc>
+          <w:tcPr>
+            <w:tcW w:type="dxa" w:w="4160"/>
+            <w:tcBorders>
+              <w:top w:val="single" w:color="BFC7CE" w:sz="4"/>
+              <w:left w:val="single" w:color="BFC7CE" w:sz="4"/>
+              <w:bottom w:val="single" w:color="BFC7CE" w:sz="4"/>
+              <w:right w:val="single" w:color="BFC7CE" w:sz="4"/>
+            </w:tcBorders>
+            <w:tcMar>
+              <w:top w:type="dxa" w:w="60"/>
+              <w:left w:type="dxa" w:w="100"/>
+              <w:bottom w:type="dxa" w:w="60"/>
+              <w:right w:type="dxa" w:w="100"/>
+            </w:tcMar>
+          </w:tcPr>
+          <w:p>
+            <w:r>
+              <w:rPr>
+                <w:b w:val="false"/>
+                <w:bCs w:val="false"/>
+                <w:sz w:val="20"/>
+                <w:szCs w:val="20"/>
+              </w:rPr>
+              <w:t xml:space="preserve">Isentropic efficiency (total-to-total)</w:t>
+            </w:r>
+          </w:p>
+        </w:tc>
+        <w:tc>
+          <w:tcPr>
+            <w:tcW w:type="dxa" w:w="2600"/>
+            <w:tcBorders>
+              <w:top w:val="single" w:color="BFC7CE" w:sz="4"/>
+              <w:left w:val="single" w:color="BFC7CE" w:sz="4"/>
+              <w:bottom w:val="single" w:color="BFC7CE" w:sz="4"/>
+              <w:right w:val="single" w:color="BFC7CE" w:sz="4"/>
+            </w:tcBorders>
+            <w:tcMar>
+              <w:top w:type="dxa" w:w="60"/>
+              <w:left w:type="dxa" w:w="100"/>
+              <w:bottom w:type="dxa" w:w="60"/>
+              <w:right w:type="dxa" w:w="100"/>
+            </w:tcMar>
+          </w:tcPr>
+          <w:p>
+            <w:r>
+              <w:rPr>
+                <w:b w:val="false"/>
+                <w:bCs w:val="false"/>
+                <w:sz w:val="20"/>
+                <w:szCs w:val="20"/>
+              </w:rPr>
+              <w:t xml:space="preserve">0.90</w:t>
+            </w:r>
+          </w:p>
+        </w:tc>
+        <w:tc>
+          <w:tcPr>
+            <w:tcW w:type="dxa" w:w="2600"/>
+            <w:tcBorders>
+              <w:top w:val="single" w:color="BFC7CE" w:sz="4"/>
+              <w:left w:val="single" w:color="BFC7CE" w:sz="4"/>
+              <w:bottom w:val="single" w:color="BFC7CE" w:sz="4"/>
+              <w:right w:val="single" w:color="BFC7CE" w:sz="4"/>
+            </w:tcBorders>
+            <w:tcMar>
+              <w:top w:type="dxa" w:w="60"/>
+              <w:left w:type="dxa" w:w="100"/>
+              <w:bottom w:type="dxa" w:w="60"/>
+              <w:right w:type="dxa" w:w="100"/>
+            </w:tcMar>
+          </w:tcPr>
+          <w:p>
+            <w:r>
+              <w:rPr>
+                <w:b w:val="false"/>
+                <w:bCs w:val="false"/>
+                <w:sz w:val="20"/>
+                <w:szCs w:val="20"/>
+              </w:rPr>
+              <w:t xml:space="preserve">0.90 (impeller assumption)</w:t>
+            </w:r>
+          </w:p>
+        </w:tc>
+      </w:tr>
+      <w:tr>
+        <w:tc>
+          <w:tcPr>
+            <w:tcW w:type="dxa" w:w="4160"/>
+            <w:tcBorders>
+              <w:top w:val="single" w:color="BFC7CE" w:sz="4"/>
+              <w:left w:val="single" w:color="BFC7CE" w:sz="4"/>
+              <w:bottom w:val="single" w:color="BFC7CE" w:sz="4"/>
+              <w:right w:val="single" w:color="BFC7CE" w:sz="4"/>
+            </w:tcBorders>
+            <w:tcMar>
+              <w:top w:type="dxa" w:w="60"/>
+              <w:left w:type="dxa" w:w="100"/>
+              <w:bottom w:type="dxa" w:w="60"/>
+              <w:right w:type="dxa" w:w="100"/>
+            </w:tcMar>
+          </w:tcPr>
+          <w:p>
+            <w:r>
+              <w:rPr>
+                <w:b w:val="false"/>
+                <w:bCs w:val="false"/>
+                <w:sz w:val="20"/>
+                <w:szCs w:val="20"/>
+              </w:rPr>
+              <w:t xml:space="preserve">Gas power, whole wheel</w:t>
+            </w:r>
+          </w:p>
+        </w:tc>
+        <w:tc>
+          <w:tcPr>
+            <w:tcW w:type="dxa" w:w="2600"/>
+            <w:tcBorders>
+              <w:top w:val="single" w:color="BFC7CE" w:sz="4"/>
+              <w:left w:val="single" w:color="BFC7CE" w:sz="4"/>
+              <w:bottom w:val="single" w:color="BFC7CE" w:sz="4"/>
+              <w:right w:val="single" w:color="BFC7CE" w:sz="4"/>
+            </w:tcBorders>
+            <w:tcMar>
+              <w:top w:type="dxa" w:w="60"/>
+              <w:left w:type="dxa" w:w="100"/>
+              <w:bottom w:type="dxa" w:w="60"/>
+              <w:right w:type="dxa" w:w="100"/>
+            </w:tcMar>
+          </w:tcPr>
+          <w:p>
+            <w:r>
+              <w:rPr>
+                <w:b w:val="false"/>
+                <w:bCs w:val="false"/>
+                <w:sz w:val="20"/>
+                <w:szCs w:val="20"/>
+              </w:rPr>
+              <w:t xml:space="preserve">51.9 kW</w:t>
+            </w:r>
+          </w:p>
+        </w:tc>
+        <w:tc>
+          <w:tcPr>
+            <w:tcW w:type="dxa" w:w="2600"/>
+            <w:tcBorders>
+              <w:top w:val="single" w:color="BFC7CE" w:sz="4"/>
+              <w:left w:val="single" w:color="BFC7CE" w:sz="4"/>
+              <w:bottom w:val="single" w:color="BFC7CE" w:sz="4"/>
+              <w:right w:val="single" w:color="BFC7CE" w:sz="4"/>
+            </w:tcBorders>
+            <w:tcMar>
+              <w:top w:type="dxa" w:w="60"/>
+              <w:left w:type="dxa" w:w="100"/>
+              <w:bottom w:type="dxa" w:w="60"/>
+              <w:right w:type="dxa" w:w="100"/>
+            </w:tcMar>
+          </w:tcPr>
+          <w:p>
+            <w:r>
+              <w:rPr>
+                <w:b w:val="false"/>
+                <w:bCs w:val="false"/>
+                <w:sz w:val="20"/>
+                <w:szCs w:val="20"/>
+              </w:rPr>
+              <w:t xml:space="preserve">≈ 55 kW</w:t>
+            </w:r>
+          </w:p>
+        </w:tc>
+      </w:tr>
+      <w:tr>
+        <w:tc>
+          <w:tcPr>
+            <w:tcW w:type="dxa" w:w="4160"/>
+            <w:tcBorders>
+              <w:top w:val="single" w:color="BFC7CE" w:sz="4"/>
+              <w:left w:val="single" w:color="BFC7CE" w:sz="4"/>
+              <w:bottom w:val="single" w:color="BFC7CE" w:sz="4"/>
+              <w:right w:val="single" w:color="BFC7CE" w:sz="4"/>
+            </w:tcBorders>
+            <w:tcMar>
+              <w:top w:type="dxa" w:w="60"/>
+              <w:left w:type="dxa" w:w="100"/>
+              <w:bottom w:type="dxa" w:w="60"/>
+              <w:right w:type="dxa" w:w="100"/>
+            </w:tcMar>
+          </w:tcPr>
+          <w:p>
+            <w:r>
+              <w:rPr>
+                <w:b w:val="false"/>
+                <w:bCs w:val="false"/>
+                <w:sz w:val="20"/>
+                <w:szCs w:val="20"/>
+              </w:rPr>
+              <w:t xml:space="preserve">Outlet static pressure / temperature</w:t>
+            </w:r>
+          </w:p>
+        </w:tc>
+        <w:tc>
+          <w:tcPr>
+            <w:tcW w:type="dxa" w:w="2600"/>
+            <w:tcBorders>
+              <w:top w:val="single" w:color="BFC7CE" w:sz="4"/>
+              <w:left w:val="single" w:color="BFC7CE" w:sz="4"/>
+              <w:bottom w:val="single" w:color="BFC7CE" w:sz="4"/>
+              <w:right w:val="single" w:color="BFC7CE" w:sz="4"/>
+            </w:tcBorders>
+            <w:tcMar>
+              <w:top w:type="dxa" w:w="60"/>
+              <w:left w:type="dxa" w:w="100"/>
+              <w:bottom w:type="dxa" w:w="60"/>
+              <w:right w:type="dxa" w:w="100"/>
+            </w:tcMar>
+          </w:tcPr>
+          <w:p>
+            <w:r>
+              <w:rPr>
+                <w:b w:val="false"/>
+                <w:bCs w:val="false"/>
+                <w:sz w:val="20"/>
+                <w:szCs w:val="20"/>
+              </w:rPr>
+              <w:t xml:space="preserve">994.8 kPa / 319.7 K</w:t>
+            </w:r>
+          </w:p>
+        </w:tc>
+        <w:tc>
+          <w:tcPr>
+            <w:tcW w:type="dxa" w:w="2600"/>
+            <w:tcBorders>
+              <w:top w:val="single" w:color="BFC7CE" w:sz="4"/>
+              <w:left w:val="single" w:color="BFC7CE" w:sz="4"/>
+              <w:bottom w:val="single" w:color="BFC7CE" w:sz="4"/>
+              <w:right w:val="single" w:color="BFC7CE" w:sz="4"/>
+            </w:tcBorders>
+            <w:tcMar>
+              <w:top w:type="dxa" w:w="60"/>
+              <w:left w:type="dxa" w:w="100"/>
+              <w:bottom w:type="dxa" w:w="60"/>
+              <w:right w:type="dxa" w:w="100"/>
+            </w:tcMar>
+          </w:tcPr>
+          <w:p>
+            <w:r>
+              <w:rPr>
+                <w:b w:val="false"/>
+                <w:bCs w:val="false"/>
+                <w:sz w:val="20"/>
+                <w:szCs w:val="20"/>
+              </w:rPr>
+              <w:t xml:space="preserve">—</w:t>
+            </w:r>
+          </w:p>
+        </w:tc>
+      </w:tr>
+      <w:tr>
+        <w:tc>
+          <w:tcPr>
+            <w:tcW w:type="dxa" w:w="4160"/>
+            <w:tcBorders>
+              <w:top w:val="single" w:color="BFC7CE" w:sz="4"/>
+              <w:left w:val="single" w:color="BFC7CE" w:sz="4"/>
+              <w:bottom w:val="single" w:color="BFC7CE" w:sz="4"/>
+              <w:right w:val="single" w:color="BFC7CE" w:sz="4"/>
+            </w:tcBorders>
+            <w:tcMar>
+              <w:top w:type="dxa" w:w="60"/>
+              <w:left w:type="dxa" w:w="100"/>
+              <w:bottom w:type="dxa" w:w="60"/>
+              <w:right w:type="dxa" w:w="100"/>
+            </w:tcMar>
+          </w:tcPr>
+          <w:p>
+            <w:r>
+              <w:rPr>
+                <w:b w:val="false"/>
+                <w:bCs w:val="false"/>
+                <w:sz w:val="20"/>
+                <w:szCs w:val="20"/>
+              </w:rPr>
+              <w:t xml:space="preserve">Outlet superheat above saturation</w:t>
+            </w:r>
+          </w:p>
+        </w:tc>
+        <w:tc>
+          <w:tcPr>
+            <w:tcW w:type="dxa" w:w="2600"/>
+            <w:tcBorders>
+              <w:top w:val="single" w:color="BFC7CE" w:sz="4"/>
+              <w:left w:val="single" w:color="BFC7CE" w:sz="4"/>
+              <w:bottom w:val="single" w:color="BFC7CE" w:sz="4"/>
+              <w:right w:val="single" w:color="BFC7CE" w:sz="4"/>
+            </w:tcBorders>
+            <w:tcMar>
+              <w:top w:type="dxa" w:w="60"/>
+              <w:left w:type="dxa" w:w="100"/>
+              <w:bottom w:type="dxa" w:w="60"/>
+              <w:right w:type="dxa" w:w="100"/>
+            </w:tcMar>
+          </w:tcPr>
+          <w:p>
+            <w:r>
+              <w:rPr>
+                <w:b w:val="false"/>
+                <w:bCs w:val="false"/>
+                <w:sz w:val="20"/>
+                <w:szCs w:val="20"/>
+              </w:rPr>
+              <w:t xml:space="preserve">7.4 K</w:t>
+            </w:r>
+          </w:p>
+        </w:tc>
+        <w:tc>
+          <w:tcPr>
+            <w:tcW w:type="dxa" w:w="2600"/>
+            <w:tcBorders>
+              <w:top w:val="single" w:color="BFC7CE" w:sz="4"/>
+              <w:left w:val="single" w:color="BFC7CE" w:sz="4"/>
+              <w:bottom w:val="single" w:color="BFC7CE" w:sz="4"/>
+              <w:right w:val="single" w:color="BFC7CE" w:sz="4"/>
+            </w:tcBorders>
+            <w:tcMar>
+              <w:top w:type="dxa" w:w="60"/>
+              <w:left w:type="dxa" w:w="100"/>
+              <w:bottom w:type="dxa" w:w="60"/>
+              <w:right w:type="dxa" w:w="100"/>
+            </w:tcMar>
+          </w:tcPr>
+          <w:p>
+            <w:r>
+              <w:rPr>
+                <w:b w:val="false"/>
+                <w:bCs w:val="false"/>
+                <w:sz w:val="20"/>
+                <w:szCs w:val="20"/>
+              </w:rPr>
+              <w:t xml:space="preserve">—</w:t>
+            </w:r>
+          </w:p>
+        </w:tc>
+      </w:tr>
+    </w:tbl>
+    <w:p>
+      <w:pPr>
+        <w:spacing w:after="140" w:line="276"/>
+      </w:pPr>
+      <w:r>
+        <w:t xml:space="preserve"/>
+      </w:r>
+    </w:p>
+    <w:p>
+      <w:pPr>
+        <w:spacing w:after="140" w:line="276"/>
+      </w:pPr>
+      <w:r>
+        <w:t xml:space="preserve">The pressure ratio is within 1 % of the meanline and the efficiency matches the impeller assumption. The work is 6 % below the meanline: the impeller produces less exit swirl than the slip model predicted (work coefficient Cθ₂/U₂ = 0.55 against 0.63). CFD-Post's derived total temperature read about 2 K low for this real-gas case and implied an efficiency above 1; the outlet total temperature above is therefore computed from the solver's total-enthalpy rise with real-gas R-134a properties.</w:t>
+      </w:r>
+    </w:p>
+    <w:p>
+      <w:pPr>
+        <w:pStyle w:val="Heading2"/>
+        <w:spacing w:after="120" w:before="240"/>
+      </w:pPr>
+      <w:r>
+        <w:t xml:space="preserve">7.3  Work and angular-momentum checks</w:t>
+      </w:r>
+    </w:p>
+    <w:p>
+      <w:pPr>
+        <w:spacing w:after="80" w:before="200"/>
+      </w:pPr>
+      <w:r>
+        <w:rPr>
+          <w:b/>
+          <w:bCs/>
+          <w:sz w:val="20"/>
+          <w:szCs w:val="20"/>
+        </w:rPr>
+        <w:t xml:space="preserve">Table 11. Stage-2 specific work from independent methods</w:t>
+      </w:r>
+    </w:p>
+    <w:tbl>
+      <w:tblPr>
+        <w:tblW w:type="dxa" w:w="9360"/>
+        <w:tblBorders>
+          <w:top w:val="single" w:color="auto" w:sz="4"/>
+          <w:left w:val="single" w:color="auto" w:sz="4"/>
+          <w:bottom w:val="single" w:color="auto" w:sz="4"/>
+          <w:right w:val="single" w:color="auto" w:sz="4"/>
+          <w:insideH w:val="single" w:color="auto" w:sz="4"/>
+          <w:insideV w:val="single" w:color="auto" w:sz="4"/>
+        </w:tblBorders>
+      </w:tblPr>
+      <w:tblGrid>
+        <w:gridCol w:w="2400"/>
+        <w:gridCol w:w="4960"/>
+        <w:gridCol w:w="2000"/>
+      </w:tblGrid>
+      <w:tr>
+        <w:trPr>
+          <w:tblHeader/>
+        </w:trPr>
+        <w:tc>
+          <w:tcPr>
+            <w:tcW w:type="dxa" w:w="2400"/>
+            <w:tcBorders>
+              <w:top w:val="single" w:color="BFC7CE" w:sz="4"/>
+              <w:left w:val="single" w:color="BFC7CE" w:sz="4"/>
+              <w:bottom w:val="single" w:color="BFC7CE" w:sz="4"/>
+              <w:right w:val="single" w:color="BFC7CE" w:sz="4"/>
+            </w:tcBorders>
+            <w:shd w:fill="DCE6EC" w:color="auto" w:val="clear"/>
+            <w:tcMar>
+              <w:top w:type="dxa" w:w="60"/>
+              <w:left w:type="dxa" w:w="100"/>
+              <w:bottom w:type="dxa" w:w="60"/>
+              <w:right w:type="dxa" w:w="100"/>
+            </w:tcMar>
+          </w:tcPr>
+          <w:p>
+            <w:r>
+              <w:rPr>
+                <w:b/>
+                <w:bCs/>
+                <w:sz w:val="20"/>
+                <w:szCs w:val="20"/>
+              </w:rPr>
+              <w:t xml:space="preserve">Method</w:t>
+            </w:r>
+          </w:p>
+        </w:tc>
+        <w:tc>
+          <w:tcPr>
+            <w:tcW w:type="dxa" w:w="4960"/>
+            <w:tcBorders>
+              <w:top w:val="single" w:color="BFC7CE" w:sz="4"/>
+              <w:left w:val="single" w:color="BFC7CE" w:sz="4"/>
+              <w:bottom w:val="single" w:color="BFC7CE" w:sz="4"/>
+              <w:right w:val="single" w:color="BFC7CE" w:sz="4"/>
+            </w:tcBorders>
+            <w:shd w:fill="DCE6EC" w:color="auto" w:val="clear"/>
+            <w:tcMar>
+              <w:top w:type="dxa" w:w="60"/>
+              <w:left w:type="dxa" w:w="100"/>
+              <w:bottom w:type="dxa" w:w="60"/>
+              <w:right w:type="dxa" w:w="100"/>
+            </w:tcMar>
+          </w:tcPr>
+          <w:p>
+            <w:r>
+              <w:rPr>
+                <w:b/>
+                <w:bCs/>
+                <w:sz w:val="20"/>
+                <w:szCs w:val="20"/>
+              </w:rPr>
+              <w:t xml:space="preserve">How it is computed</w:t>
+            </w:r>
+          </w:p>
+        </w:tc>
+        <w:tc>
+          <w:tcPr>
+            <w:tcW w:type="dxa" w:w="2000"/>
+            <w:tcBorders>
+              <w:top w:val="single" w:color="BFC7CE" w:sz="4"/>
+              <w:left w:val="single" w:color="BFC7CE" w:sz="4"/>
+              <w:bottom w:val="single" w:color="BFC7CE" w:sz="4"/>
+              <w:right w:val="single" w:color="BFC7CE" w:sz="4"/>
+            </w:tcBorders>
+            <w:shd w:fill="DCE6EC" w:color="auto" w:val="clear"/>
+            <w:tcMar>
+              <w:top w:type="dxa" w:w="60"/>
+              <w:left w:type="dxa" w:w="100"/>
+              <w:bottom w:type="dxa" w:w="60"/>
+              <w:right w:type="dxa" w:w="100"/>
+            </w:tcMar>
+          </w:tcPr>
+          <w:p>
+            <w:r>
+              <w:rPr>
+                <w:b/>
+                <w:bCs/>
+                <w:sz w:val="20"/>
+                <w:szCs w:val="20"/>
+              </w:rPr>
+              <w:t xml:space="preserve">Specific work</w:t>
+            </w:r>
+          </w:p>
+        </w:tc>
+      </w:tr>
+      <w:tr>
+        <w:tc>
+          <w:tcPr>
+            <w:tcW w:type="dxa" w:w="2400"/>
+            <w:tcBorders>
+              <w:top w:val="single" w:color="BFC7CE" w:sz="4"/>
+              <w:left w:val="single" w:color="BFC7CE" w:sz="4"/>
+              <w:bottom w:val="single" w:color="BFC7CE" w:sz="4"/>
+              <w:right w:val="single" w:color="BFC7CE" w:sz="4"/>
+            </w:tcBorders>
+            <w:tcMar>
+              <w:top w:type="dxa" w:w="60"/>
+              <w:left w:type="dxa" w:w="100"/>
+              <w:bottom w:type="dxa" w:w="60"/>
+              <w:right w:type="dxa" w:w="100"/>
+            </w:tcMar>
+          </w:tcPr>
+          <w:p>
+            <w:r>
+              <w:rPr>
+                <w:b w:val="false"/>
+                <w:bCs w:val="false"/>
+                <w:sz w:val="20"/>
+                <w:szCs w:val="20"/>
+              </w:rPr>
+              <w:t xml:space="preserve">Total-enthalpy rise</w:t>
+            </w:r>
+          </w:p>
+        </w:tc>
+        <w:tc>
+          <w:tcPr>
+            <w:tcW w:type="dxa" w:w="4960"/>
+            <w:tcBorders>
+              <w:top w:val="single" w:color="BFC7CE" w:sz="4"/>
+              <w:left w:val="single" w:color="BFC7CE" w:sz="4"/>
+              <w:bottom w:val="single" w:color="BFC7CE" w:sz="4"/>
+              <w:right w:val="single" w:color="BFC7CE" w:sz="4"/>
+            </w:tcBorders>
+            <w:tcMar>
+              <w:top w:type="dxa" w:w="60"/>
+              <w:left w:type="dxa" w:w="100"/>
+              <w:bottom w:type="dxa" w:w="60"/>
+              <w:right w:type="dxa" w:w="100"/>
+            </w:tcMar>
+          </w:tcPr>
+          <w:p>
+            <w:r>
+              <w:rPr>
+                <w:b w:val="false"/>
+                <w:bCs w:val="false"/>
+                <w:sz w:val="20"/>
+                <w:szCs w:val="20"/>
+              </w:rPr>
+              <w:t xml:space="preserve">Mass-averaged total enthalpy, outlet minus inlet</w:t>
+            </w:r>
+          </w:p>
+        </w:tc>
+        <w:tc>
+          <w:tcPr>
+            <w:tcW w:type="dxa" w:w="2000"/>
+            <w:tcBorders>
+              <w:top w:val="single" w:color="BFC7CE" w:sz="4"/>
+              <w:left w:val="single" w:color="BFC7CE" w:sz="4"/>
+              <w:bottom w:val="single" w:color="BFC7CE" w:sz="4"/>
+              <w:right w:val="single" w:color="BFC7CE" w:sz="4"/>
+            </w:tcBorders>
+            <w:tcMar>
+              <w:top w:type="dxa" w:w="60"/>
+              <w:left w:type="dxa" w:w="100"/>
+              <w:bottom w:type="dxa" w:w="60"/>
+              <w:right w:type="dxa" w:w="100"/>
+            </w:tcMar>
+          </w:tcPr>
+          <w:p>
+            <w:r>
+              <w:rPr>
+                <w:b w:val="false"/>
+                <w:bCs w:val="false"/>
+                <w:sz w:val="20"/>
+                <w:szCs w:val="20"/>
+              </w:rPr>
+              <w:t xml:space="preserve">15.54 kJ/kg</w:t>
+            </w:r>
+          </w:p>
+        </w:tc>
+      </w:tr>
+      <w:tr>
+        <w:tc>
+          <w:tcPr>
+            <w:tcW w:type="dxa" w:w="2400"/>
+            <w:tcBorders>
+              <w:top w:val="single" w:color="BFC7CE" w:sz="4"/>
+              <w:left w:val="single" w:color="BFC7CE" w:sz="4"/>
+              <w:bottom w:val="single" w:color="BFC7CE" w:sz="4"/>
+              <w:right w:val="single" w:color="BFC7CE" w:sz="4"/>
+            </w:tcBorders>
+            <w:tcMar>
+              <w:top w:type="dxa" w:w="60"/>
+              <w:left w:type="dxa" w:w="100"/>
+              <w:bottom w:type="dxa" w:w="60"/>
+              <w:right w:type="dxa" w:w="100"/>
+            </w:tcMar>
+          </w:tcPr>
+          <w:p>
+            <w:r>
+              <w:rPr>
+                <w:b w:val="false"/>
+                <w:bCs w:val="false"/>
+                <w:sz w:val="20"/>
+                <w:szCs w:val="20"/>
+              </w:rPr>
+              <w:t xml:space="preserve">Rotor torque</w:t>
+            </w:r>
+          </w:p>
+        </w:tc>
+        <w:tc>
+          <w:tcPr>
+            <w:tcW w:type="dxa" w:w="4960"/>
+            <w:tcBorders>
+              <w:top w:val="single" w:color="BFC7CE" w:sz="4"/>
+              <w:left w:val="single" w:color="BFC7CE" w:sz="4"/>
+              <w:bottom w:val="single" w:color="BFC7CE" w:sz="4"/>
+              <w:right w:val="single" w:color="BFC7CE" w:sz="4"/>
+            </w:tcBorders>
+            <w:tcMar>
+              <w:top w:type="dxa" w:w="60"/>
+              <w:left w:type="dxa" w:w="100"/>
+              <w:bottom w:type="dxa" w:w="60"/>
+              <w:right w:type="dxa" w:w="100"/>
+            </w:tcMar>
+          </w:tcPr>
+          <w:p>
+            <w:r>
+              <w:rPr>
+                <w:b w:val="false"/>
+                <w:bCs w:val="false"/>
+                <w:sz w:val="20"/>
+                <w:szCs w:val="20"/>
+              </w:rPr>
+              <w:t xml:space="preserve">2.314 N·m per passage (blade + rotating hub) × 3141.6 rad/s ÷ 0.4776 kg/s</w:t>
+            </w:r>
+          </w:p>
+        </w:tc>
+        <w:tc>
+          <w:tcPr>
+            <w:tcW w:type="dxa" w:w="2000"/>
+            <w:tcBorders>
+              <w:top w:val="single" w:color="BFC7CE" w:sz="4"/>
+              <w:left w:val="single" w:color="BFC7CE" w:sz="4"/>
+              <w:bottom w:val="single" w:color="BFC7CE" w:sz="4"/>
+              <w:right w:val="single" w:color="BFC7CE" w:sz="4"/>
+            </w:tcBorders>
+            <w:tcMar>
+              <w:top w:type="dxa" w:w="60"/>
+              <w:left w:type="dxa" w:w="100"/>
+              <w:bottom w:type="dxa" w:w="60"/>
+              <w:right w:type="dxa" w:w="100"/>
+            </w:tcMar>
+          </w:tcPr>
+          <w:p>
+            <w:r>
+              <w:rPr>
+                <w:b w:val="false"/>
+                <w:bCs w:val="false"/>
+                <w:sz w:val="20"/>
+                <w:szCs w:val="20"/>
+              </w:rPr>
+              <w:t xml:space="preserve">15.23 kJ/kg</w:t>
+            </w:r>
+          </w:p>
+        </w:tc>
+      </w:tr>
+      <w:tr>
+        <w:tc>
+          <w:tcPr>
+            <w:tcW w:type="dxa" w:w="2400"/>
+            <w:tcBorders>
+              <w:top w:val="single" w:color="BFC7CE" w:sz="4"/>
+              <w:left w:val="single" w:color="BFC7CE" w:sz="4"/>
+              <w:bottom w:val="single" w:color="BFC7CE" w:sz="4"/>
+              <w:right w:val="single" w:color="BFC7CE" w:sz="4"/>
+            </w:tcBorders>
+            <w:tcMar>
+              <w:top w:type="dxa" w:w="60"/>
+              <w:left w:type="dxa" w:w="100"/>
+              <w:bottom w:type="dxa" w:w="60"/>
+              <w:right w:type="dxa" w:w="100"/>
+            </w:tcMar>
+          </w:tcPr>
+          <w:p>
+            <w:r>
+              <w:rPr>
+                <w:b w:val="false"/>
+                <w:bCs w:val="false"/>
+                <w:sz w:val="20"/>
+                <w:szCs w:val="20"/>
+              </w:rPr>
+              <w:t xml:space="preserve">Euler + shroud friction</w:t>
+            </w:r>
+          </w:p>
+        </w:tc>
+        <w:tc>
+          <w:tcPr>
+            <w:tcW w:type="dxa" w:w="4960"/>
+            <w:tcBorders>
+              <w:top w:val="single" w:color="BFC7CE" w:sz="4"/>
+              <w:left w:val="single" w:color="BFC7CE" w:sz="4"/>
+              <w:bottom w:val="single" w:color="BFC7CE" w:sz="4"/>
+              <w:right w:val="single" w:color="BFC7CE" w:sz="4"/>
+            </w:tcBorders>
+            <w:tcMar>
+              <w:top w:type="dxa" w:w="60"/>
+              <w:left w:type="dxa" w:w="100"/>
+              <w:bottom w:type="dxa" w:w="60"/>
+              <w:right w:type="dxa" w:w="100"/>
+            </w:tcMar>
+          </w:tcPr>
+          <w:p>
+            <w:r>
+              <w:rPr>
+                <w:b w:val="false"/>
+                <w:bCs w:val="false"/>
+                <w:sz w:val="20"/>
+                <w:szCs w:val="20"/>
+              </w:rPr>
+              <w:t xml:space="preserve">ω·(r·Cθ) at r = 52 mm (14.6 kJ/kg) plus stationary-shroud friction torque × ω ÷ ṁ (0.62 kJ/kg)</w:t>
+            </w:r>
+          </w:p>
+        </w:tc>
+        <w:tc>
+          <w:tcPr>
+            <w:tcW w:type="dxa" w:w="2000"/>
+            <w:tcBorders>
+              <w:top w:val="single" w:color="BFC7CE" w:sz="4"/>
+              <w:left w:val="single" w:color="BFC7CE" w:sz="4"/>
+              <w:bottom w:val="single" w:color="BFC7CE" w:sz="4"/>
+              <w:right w:val="single" w:color="BFC7CE" w:sz="4"/>
+            </w:tcBorders>
+            <w:tcMar>
+              <w:top w:type="dxa" w:w="60"/>
+              <w:left w:type="dxa" w:w="100"/>
+              <w:bottom w:type="dxa" w:w="60"/>
+              <w:right w:type="dxa" w:w="100"/>
+            </w:tcMar>
+          </w:tcPr>
+          <w:p>
+            <w:r>
+              <w:rPr>
+                <w:b w:val="false"/>
+                <w:bCs w:val="false"/>
+                <w:sz w:val="20"/>
+                <w:szCs w:val="20"/>
+              </w:rPr>
+              <w:t xml:space="preserve">15.2 kJ/kg</w:t>
+            </w:r>
+          </w:p>
+        </w:tc>
+      </w:tr>
+    </w:tbl>
+    <w:p>
+      <w:pPr>
+        <w:spacing w:after="140" w:line="276"/>
+      </w:pPr>
+      <w:r>
+        <w:t xml:space="preserve"/>
+      </w:r>
+    </w:p>
+    <w:p>
+      <w:pPr>
+        <w:spacing w:after="140" w:line="276"/>
+      </w:pPr>
+      <w:r>
+        <w:t xml:space="preserve">The three methods agree within 2 %. About 4 % of the rotor work goes into friction on the stationary shroud rather than into swirl. The mass-averaged angular momentum r·Cθ is 4.66 m²/s at the impeller exit and 4.61 m²/s at the domain outlet: it falls slightly through the vaneless diffuser, as wall friction should make it, which confirms that the diffuser walls are correctly modelled as stationary.</w:t>
+      </w:r>
+    </w:p>
+    <w:p>
+      <w:pPr>
+        <w:spacing w:before="120"/>
+        <w:jc w:val="center"/>
+      </w:pPr>
+      <w:r>
+        <w:drawing>
+          <wp:inline distT="0" distB="0" distL="0" distR="0">
+            <wp:extent cx="5486400" cy="3429000"/>
+            <wp:effectExtent t="0" r="0" b="0" l="0"/>
+            <wp:docPr id="1" name="" descr="" title=""/>
+            <wp:cNvGraphicFramePr>
+              <a:graphicFrameLocks xmlns:a="http://schemas.openxmlformats.org/drawingml/2006/main" noChangeAspect="1"/>
+            </wp:cNvGraphicFramePr>
+            <a:graphic xmlns:a="http://schemas.openxmlformats.org/drawingml/2006/main">
+              <a:graphicData uri="http://schemas.openxmlformats.org/drawingml/2006/picture">
+                <pic:pic xmlns:pic="http://schemas.openxmlformats.org/drawingml/2006/picture">
+                  <pic:nvPicPr>
+                    <pic:cNvPr id="0" name="" descr=""/>
+                    <pic:cNvPicPr>
+                      <a:picLocks noChangeAspect="1" noChangeArrowheads="1"/>
+                    </pic:cNvPicPr>
+                  </pic:nvPicPr>
+                  <pic:blipFill>
+                    <a:blip r:embed="rId11" cstate="none"/>
+                    <a:srcRect/>
+                    <a:stretch>
+                      <a:fillRect/>
+                    </a:stretch>
+                  </pic:blipFill>
+                  <pic:spPr bwMode="auto">
+                    <a:xfrm>
+                      <a:off x="0" y="0"/>
+                      <a:ext cx="5486400" cy="3429000"/>
+                    </a:xfrm>
+                    <a:prstGeom prst="rect">
+                      <a:avLst/>
+                    </a:prstGeom>
+                  </pic:spPr>
+                </pic:pic>
+              </a:graphicData>
+            </a:graphic>
+          </wp:inline>
+        </w:drawing>
+      </w:r>
+    </w:p>
+    <w:p>
+      <w:pPr>
+        <w:spacing w:after="240" w:before="60"/>
+        <w:jc w:val="center"/>
+      </w:pPr>
+      <w:r>
+        <w:rPr>
+          <w:i/>
+          <w:iCs/>
+          <w:color w:val="444444"/>
+          <w:sz w:val="20"/>
+          <w:szCs w:val="20"/>
+        </w:rPr>
+        <w:t xml:space="preserve">Figure 10. Mass-averaged angular momentum r·Cθ along the flow path (0 = inlet, 1 = outlet; impeller trailing edge at about 0.70). The rise beyond about 0.9 is an averaging artifact from reverse-flow faces at the outlet boundary; plane averages give 4.66 m²/s at the impeller exit and 4.61 m²/s at the outlet.</w:t>
+      </w:r>
+    </w:p>
+    <w:p>
+      <w:pPr>
+        <w:pStyle w:val="Heading2"/>
+        <w:spacing w:after="120" w:before="240"/>
+      </w:pPr>
+      <w:r>
+        <w:t xml:space="preserve">7.4  Where the losses are</w:t>
+      </w:r>
+    </w:p>
+    <w:p>
+      <w:pPr>
+        <w:spacing w:after="140" w:line="276"/>
+      </w:pPr>
+      <w:r>
+        <w:t xml:space="preserve">Mass-averaged static entropy rises by 5.1 J/(kg·K) between the inlet and the impeller exit and by a further 10.4 J/(kg·K) through the vaneless diffuser, so most of the stage loss is in the diffuser rather than the impeller. The diffuser exit flow is far from uniform: the mass-averaged absolute Mach number at the outlet is still 0.68, the total-to-static pressure ratio is only 1.38, and reverse flow blocks about 5.5 % of the outlet area. Because of this non-uniformity, single-number averages disagree: mass-averaged total pressure gives a pressure ratio of 1.95, while a uniform state rebuilt from the averaged static pressure, temperature and velocity gives 1.73. The true mixed-out performance lies between the two. The short vaneless diffuser leaves much of the exit kinetic energy unrecovered; in the real machine the return channel or volute does that job.</w:t>
+      </w:r>
+    </w:p>
+    <w:p>
+      <w:pPr>
+        <w:spacing w:before="120"/>
+        <w:jc w:val="center"/>
+      </w:pPr>
+      <w:r>
+        <w:drawing>
+          <wp:inline distT="0" distB="0" distL="0" distR="0">
+            <wp:extent cx="4206240" cy="3542247"/>
+            <wp:effectExtent t="0" r="0" b="0" l="0"/>
+            <wp:docPr id="1" name="" descr="" title=""/>
+            <wp:cNvGraphicFramePr>
+              <a:graphicFrameLocks xmlns:a="http://schemas.openxmlformats.org/drawingml/2006/main" noChangeAspect="1"/>
+            </wp:cNvGraphicFramePr>
+            <a:graphic xmlns:a="http://schemas.openxmlformats.org/drawingml/2006/main">
+              <a:graphicData uri="http://schemas.openxmlformats.org/drawingml/2006/picture">
+                <pic:pic xmlns:pic="http://schemas.openxmlformats.org/drawingml/2006/picture">
+                  <pic:nvPicPr>
+                    <pic:cNvPr id="0" name="" descr=""/>
+                    <pic:cNvPicPr>
+                      <a:picLocks noChangeAspect="1" noChangeArrowheads="1"/>
+                    </pic:cNvPicPr>
+                  </pic:nvPicPr>
+                  <pic:blipFill>
+                    <a:blip r:embed="rId12" cstate="none"/>
+                    <a:srcRect/>
+                    <a:stretch>
+                      <a:fillRect/>
+                    </a:stretch>
+                  </pic:blipFill>
+                  <pic:spPr bwMode="auto">
+                    <a:xfrm>
+                      <a:off x="0" y="0"/>
+                      <a:ext cx="4206240" cy="3542247"/>
+                    </a:xfrm>
+                    <a:prstGeom prst="rect">
+                      <a:avLst/>
+                    </a:prstGeom>
+                  </pic:spPr>
+                </pic:pic>
+              </a:graphicData>
+            </a:graphic>
+          </wp:inline>
+        </w:drawing>
+      </w:r>
+    </w:p>
+    <w:p>
+      <w:pPr>
+        <w:spacing w:after="240" w:before="60"/>
+        <w:jc w:val="center"/>
+      </w:pPr>
+      <w:r>
+        <w:rPr>
+          <w:i/>
+          <w:iCs/>
+          <w:color w:val="444444"/>
+          <w:sz w:val="20"/>
+          <w:szCs w:val="20"/>
+        </w:rPr>
+        <w:t xml:space="preserve">Figure 11. Circumferentially averaged static entropy, stage 2. Entropy rises along the shroud from mid-passage and is carried through the impeller exit and the diffuser.</w:t>
+      </w:r>
+    </w:p>
+    <w:p>
+      <w:pPr>
+        <w:spacing w:before="120"/>
+        <w:jc w:val="center"/>
+      </w:pPr>
+      <w:r>
+        <w:drawing>
+          <wp:inline distT="0" distB="0" distL="0" distR="0">
+            <wp:extent cx="4206240" cy="3542247"/>
+            <wp:effectExtent t="0" r="0" b="0" l="0"/>
+            <wp:docPr id="1" name="" descr="" title=""/>
+            <wp:cNvGraphicFramePr>
+              <a:graphicFrameLocks xmlns:a="http://schemas.openxmlformats.org/drawingml/2006/main" noChangeAspect="1"/>
+            </wp:cNvGraphicFramePr>
+            <a:graphic xmlns:a="http://schemas.openxmlformats.org/drawingml/2006/main">
+              <a:graphicData uri="http://schemas.openxmlformats.org/drawingml/2006/picture">
+                <pic:pic xmlns:pic="http://schemas.openxmlformats.org/drawingml/2006/picture">
+                  <pic:nvPicPr>
+                    <pic:cNvPr id="0" name="" descr=""/>
+                    <pic:cNvPicPr>
+                      <a:picLocks noChangeAspect="1" noChangeArrowheads="1"/>
+                    </pic:cNvPicPr>
+                  </pic:nvPicPr>
+                  <pic:blipFill>
+                    <a:blip r:embed="rId13" cstate="none"/>
+                    <a:srcRect/>
+                    <a:stretch>
+                      <a:fillRect/>
+                    </a:stretch>
+                  </pic:blipFill>
+                  <pic:spPr bwMode="auto">
+                    <a:xfrm>
+                      <a:off x="0" y="0"/>
+                      <a:ext cx="4206240" cy="3542247"/>
+                    </a:xfrm>
+                    <a:prstGeom prst="rect">
+                      <a:avLst/>
+                    </a:prstGeom>
+                  </pic:spPr>
+                </pic:pic>
+              </a:graphicData>
+            </a:graphic>
+          </wp:inline>
+        </w:drawing>
+      </w:r>
+    </w:p>
+    <w:p>
+      <w:pPr>
+        <w:spacing w:after="240" w:before="60"/>
+        <w:jc w:val="center"/>
+      </w:pPr>
+      <w:r>
+        <w:rPr>
+          <w:i/>
+          <w:iCs/>
+          <w:color w:val="444444"/>
+          <w:sz w:val="20"/>
+          <w:szCs w:val="20"/>
+        </w:rPr>
+        <w:t xml:space="preserve">Figure 12. Circumferentially averaged absolute velocity, stage 2. A low-velocity region forms on the shroud side around the bend; the velocity peaks at about 120 m/s at the impeller exit and falls only to about 85–90 m/s by the outlet.</w:t>
+      </w:r>
+    </w:p>
+    <w:p>
+      <w:pPr>
+        <w:pStyle w:val="Heading2"/>
+        <w:spacing w:after="120" w:before="240"/>
+      </w:pPr>
+      <w:r>
+        <w:t xml:space="preserve">7.5  Flow field</w:t>
+      </w:r>
+    </w:p>
+    <w:p>
+      <w:pPr>
+        <w:spacing w:after="140" w:line="276"/>
+      </w:pPr>
+      <w:r>
+        <w:t xml:space="preserve">The relative Mach number (Figure 13) shows clean, attached flow near the hub and a growing low-momentum region beside the main blade toward the trailing edge as the span increases. At 90 % span it fills much of the rear passage (relative Mach number 0–0.2), next to a high-velocity jet. This is the jet-wake pattern of centrifugal impellers, driven by tip leakage and secondary flow. The inlet relative Mach number at the tip is about 0.7, against 0.73 from the meanline. Downstream of the trailing edge the relative Mach number reflects the rotating reference frame and has no physical meaning in the stationary diffuser.</w:t>
+      </w:r>
+    </w:p>
+    <w:p>
+      <w:pPr>
+        <w:spacing w:before="120"/>
+        <w:jc w:val="center"/>
+      </w:pPr>
+      <w:r>
+        <w:drawing>
+          <wp:inline distT="0" distB="0" distL="0" distR="0">
+            <wp:extent cx="5943600" cy="1994422"/>
+            <wp:effectExtent t="0" r="0" b="0" l="0"/>
+            <wp:docPr id="1" name="" descr="" title=""/>
+            <wp:cNvGraphicFramePr>
+              <a:graphicFrameLocks xmlns:a="http://schemas.openxmlformats.org/drawingml/2006/main" noChangeAspect="1"/>
+            </wp:cNvGraphicFramePr>
+            <a:graphic xmlns:a="http://schemas.openxmlformats.org/drawingml/2006/main">
+              <a:graphicData uri="http://schemas.openxmlformats.org/drawingml/2006/picture">
+                <pic:pic xmlns:pic="http://schemas.openxmlformats.org/drawingml/2006/picture">
+                  <pic:nvPicPr>
+                    <pic:cNvPr id="0" name="" descr=""/>
+                    <pic:cNvPicPr>
+                      <a:picLocks noChangeAspect="1" noChangeArrowheads="1"/>
+                    </pic:cNvPicPr>
+                  </pic:nvPicPr>
+                  <pic:blipFill>
+                    <a:blip r:embed="rId14" cstate="none"/>
+                    <a:srcRect/>
+                    <a:stretch>
+                      <a:fillRect/>
+                    </a:stretch>
+                  </pic:blipFill>
+                  <pic:spPr bwMode="auto">
+                    <a:xfrm>
+                      <a:off x="0" y="0"/>
+                      <a:ext cx="5943600" cy="1994422"/>
+                    </a:xfrm>
+                    <a:prstGeom prst="rect">
+                      <a:avLst/>
+                    </a:prstGeom>
+                  </pic:spPr>
+                </pic:pic>
+              </a:graphicData>
+            </a:graphic>
+          </wp:inline>
+        </w:drawing>
+      </w:r>
+    </w:p>
+    <w:p>
+      <w:pPr>
+        <w:spacing w:after="240" w:before="60"/>
+        <w:jc w:val="center"/>
+      </w:pPr>
+      <w:r>
+        <w:rPr>
+          <w:i/>
+          <w:iCs/>
+          <w:color w:val="444444"/>
+          <w:sz w:val="20"/>
+          <w:szCs w:val="20"/>
+        </w:rPr>
+        <w:t xml:space="preserve">Figure 13. Relative Mach number, blade-to-blade view, stage 2 at the design point. The jagged line just after the trailing edges is a plotting artifact at the mesh-block interface.</w:t>
+      </w:r>
+    </w:p>
+    <w:p>
+      <w:pPr>
+        <w:spacing w:after="140" w:line="276"/>
+      </w:pPr>
+      <w:r>
+        <w:t xml:space="preserve">In the absolute frame (Figure 14) the flow leaves the blades as a near-sonic jet (absolute Mach number 0.9–1.0 locally) and slows to about 0.5–0.6 at the outlet, with the blade wakes still visible as streaks.</w:t>
+      </w:r>
+    </w:p>
+    <w:p>
+      <w:pPr>
+        <w:spacing w:before="120"/>
+        <w:jc w:val="center"/>
+      </w:pPr>
+      <w:r>
+        <w:drawing>
+          <wp:inline distT="0" distB="0" distL="0" distR="0">
+            <wp:extent cx="4206240" cy="3187859"/>
+            <wp:effectExtent t="0" r="0" b="0" l="0"/>
+            <wp:docPr id="1" name="" descr="" title=""/>
+            <wp:cNvGraphicFramePr>
+              <a:graphicFrameLocks xmlns:a="http://schemas.openxmlformats.org/drawingml/2006/main" noChangeAspect="1"/>
+            </wp:cNvGraphicFramePr>
+            <a:graphic xmlns:a="http://schemas.openxmlformats.org/drawingml/2006/main">
+              <a:graphicData uri="http://schemas.openxmlformats.org/drawingml/2006/picture">
+                <pic:pic xmlns:pic="http://schemas.openxmlformats.org/drawingml/2006/picture">
+                  <pic:nvPicPr>
+                    <pic:cNvPr id="0" name="" descr=""/>
+                    <pic:cNvPicPr>
+                      <a:picLocks noChangeAspect="1" noChangeArrowheads="1"/>
+                    </pic:cNvPicPr>
+                  </pic:nvPicPr>
+                  <pic:blipFill>
+                    <a:blip r:embed="rId15" cstate="none"/>
+                    <a:srcRect/>
+                    <a:stretch>
+                      <a:fillRect/>
+                    </a:stretch>
+                  </pic:blipFill>
+                  <pic:spPr bwMode="auto">
+                    <a:xfrm>
+                      <a:off x="0" y="0"/>
+                      <a:ext cx="4206240" cy="3187859"/>
+                    </a:xfrm>
+                    <a:prstGeom prst="rect">
+                      <a:avLst/>
+                    </a:prstGeom>
+                  </pic:spPr>
+                </pic:pic>
+              </a:graphicData>
+            </a:graphic>
+          </wp:inline>
+        </w:drawing>
+      </w:r>
+    </w:p>
+    <w:p>
+      <w:pPr>
+        <w:spacing w:after="240" w:before="60"/>
+        <w:jc w:val="center"/>
+      </w:pPr>
+      <w:r>
+        <w:rPr>
+          <w:i/>
+          <w:iCs/>
+          <w:color w:val="444444"/>
+          <w:sz w:val="20"/>
+          <w:szCs w:val="20"/>
+        </w:rPr>
+        <w:t xml:space="preserve">Figure 14. Absolute Mach number at 50 % span, stage 2.</w:t>
+      </w:r>
+    </w:p>
+    <w:p>
+      <w:pPr>
+        <w:spacing w:after="140" w:line="276"/>
+      </w:pPr>
+      <w:r>
+        <w:t xml:space="preserve">Just downstream of the impeller (Figure 15), a band of negative radial velocity runs along the shroud across most of the passage, with the blade wakes as narrow low-velocity strips and the jet on the hub side. This reverse flow is why the mass-averaged meridional velocity at this plane comes out lower than the mass-averaged radial velocity. Streamlines released in the tip gap (Figure 16) cross the blade tips, mix into the passage and leave as a high-entropy stream along the shroud side of the diffuser, which links the tip leakage to the shroud-side entropy in Figure 11.</w:t>
+      </w:r>
+    </w:p>
+    <w:p>
+      <w:pPr>
+        <w:spacing w:before="120"/>
+        <w:jc w:val="center"/>
+      </w:pPr>
+      <w:r>
+        <w:drawing>
+          <wp:inline distT="0" distB="0" distL="0" distR="0">
+            <wp:extent cx="5943600" cy="1734718"/>
+            <wp:effectExtent t="0" r="0" b="0" l="0"/>
+            <wp:docPr id="1" name="" descr="" title=""/>
+            <wp:cNvGraphicFramePr>
+              <a:graphicFrameLocks xmlns:a="http://schemas.openxmlformats.org/drawingml/2006/main" noChangeAspect="1"/>
+            </wp:cNvGraphicFramePr>
+            <a:graphic xmlns:a="http://schemas.openxmlformats.org/drawingml/2006/main">
+              <a:graphicData uri="http://schemas.openxmlformats.org/drawingml/2006/picture">
+                <pic:pic xmlns:pic="http://schemas.openxmlformats.org/drawingml/2006/picture">
+                  <pic:nvPicPr>
+                    <pic:cNvPr id="0" name="" descr=""/>
+                    <pic:cNvPicPr>
+                      <a:picLocks noChangeAspect="1" noChangeArrowheads="1"/>
+                    </pic:cNvPicPr>
+                  </pic:nvPicPr>
+                  <pic:blipFill>
+                    <a:blip r:embed="rId16" cstate="none"/>
+                    <a:srcRect/>
+                    <a:stretch>
+                      <a:fillRect/>
+                    </a:stretch>
+                  </pic:blipFill>
+                  <pic:spPr bwMode="auto">
+                    <a:xfrm>
+                      <a:off x="0" y="0"/>
+                      <a:ext cx="5943600" cy="1734718"/>
+                    </a:xfrm>
+                    <a:prstGeom prst="rect">
+                      <a:avLst/>
+                    </a:prstGeom>
+                  </pic:spPr>
+                </pic:pic>
+              </a:graphicData>
+            </a:graphic>
+          </wp:inline>
+        </w:drawing>
+      </w:r>
+    </w:p>
+    <w:p>
+      <w:pPr>
+        <w:spacing w:after="240" w:before="60"/>
+        <w:jc w:val="center"/>
+      </w:pPr>
+      <w:r>
+        <w:rPr>
+          <w:i/>
+          <w:iCs/>
+          <w:color w:val="444444"/>
+          <w:sz w:val="20"/>
+          <w:szCs w:val="20"/>
+        </w:rPr>
+        <w:t xml:space="preserve">Figure 15. Radial velocity Cr on the r = 52 mm surface just downstream of the impeller trailing edge (one passage, viewed radially inward, shroud at the bottom). Black lines are contours at 20 m/s intervals; negative values are reverse flow.</w:t>
+      </w:r>
+    </w:p>
+    <w:p>
+      <w:pPr>
+        <w:spacing w:before="120"/>
+        <w:jc w:val="center"/>
+      </w:pPr>
+      <w:r>
+        <w:drawing>
+          <wp:inline distT="0" distB="0" distL="0" distR="0">
+            <wp:extent cx="4754880" cy="3513233"/>
+            <wp:effectExtent t="0" r="0" b="0" l="0"/>
+            <wp:docPr id="1" name="" descr="" title=""/>
+            <wp:cNvGraphicFramePr>
+              <a:graphicFrameLocks xmlns:a="http://schemas.openxmlformats.org/drawingml/2006/main" noChangeAspect="1"/>
+            </wp:cNvGraphicFramePr>
+            <a:graphic xmlns:a="http://schemas.openxmlformats.org/drawingml/2006/main">
+              <a:graphicData uri="http://schemas.openxmlformats.org/drawingml/2006/picture">
+                <pic:pic xmlns:pic="http://schemas.openxmlformats.org/drawingml/2006/picture">
+                  <pic:nvPicPr>
+                    <pic:cNvPr id="0" name="" descr=""/>
+                    <pic:cNvPicPr>
+                      <a:picLocks noChangeAspect="1" noChangeArrowheads="1"/>
+                    </pic:cNvPicPr>
+                  </pic:nvPicPr>
+                  <pic:blipFill>
+                    <a:blip r:embed="rId17" cstate="none"/>
+                    <a:srcRect/>
+                    <a:stretch>
+                      <a:fillRect/>
+                    </a:stretch>
+                  </pic:blipFill>
+                  <pic:spPr bwMode="auto">
+                    <a:xfrm>
+                      <a:off x="0" y="0"/>
+                      <a:ext cx="4754880" cy="3513233"/>
+                    </a:xfrm>
+                    <a:prstGeom prst="rect">
+                      <a:avLst/>
+                    </a:prstGeom>
+                  </pic:spPr>
+                </pic:pic>
+              </a:graphicData>
+            </a:graphic>
+          </wp:inline>
+        </w:drawing>
+      </w:r>
+    </w:p>
+    <w:p>
+      <w:pPr>
+        <w:spacing w:after="240" w:before="60"/>
+        <w:jc w:val="center"/>
+      </w:pPr>
+      <w:r>
+        <w:rPr>
+          <w:i/>
+          <w:iCs/>
+          <w:color w:val="444444"/>
+          <w:sz w:val="20"/>
+          <w:szCs w:val="20"/>
+        </w:rPr>
+        <w:t xml:space="preserve">Figure 16. Relative-frame streamlines seeded at 97 % span (tip-clearance region), coloured by static entropy.</w:t>
+      </w:r>
+    </w:p>
+    <w:tbl>
+      <w:tblPr>
+        <w:tblW w:type="dxa" w:w="9360"/>
+        <w:tblBorders>
+          <w:top w:val="single" w:color="auto" w:sz="4"/>
+          <w:left w:val="single" w:color="auto" w:sz="4"/>
+          <w:bottom w:val="single" w:color="auto" w:sz="4"/>
+          <w:right w:val="single" w:color="auto" w:sz="4"/>
+          <w:insideH w:val="single" w:color="auto" w:sz="4"/>
+          <w:insideV w:val="single" w:color="auto" w:sz="4"/>
+        </w:tblBorders>
+      </w:tblPr>
+      <w:tblGrid>
+        <w:gridCol w:w="9360"/>
+      </w:tblGrid>
+      <w:tr>
+        <w:tc>
+          <w:tcPr>
+            <w:tcW w:type="dxa" w:w="9360"/>
+            <w:tcBorders>
+              <w:top w:val="dashed" w:color="999999" w:sz="6"/>
+              <w:left w:val="dashed" w:color="999999" w:sz="6"/>
+              <w:bottom w:val="dashed" w:color="999999" w:sz="6"/>
+              <w:right w:val="dashed" w:color="999999" w:sz="6"/>
+            </w:tcBorders>
+            <w:shd w:fill="F4F6F8" w:color="auto" w:val="clear"/>
+            <w:tcMar>
+              <w:top w:type="dxa" w:w="600"/>
+              <w:left w:type="dxa" w:w="200"/>
+              <w:bottom w:type="dxa" w:w="600"/>
+              <w:right w:type="dxa" w:w="200"/>
+            </w:tcMar>
+          </w:tcPr>
+          <w:p>
+            <w:pPr>
+              <w:jc w:val="center"/>
+            </w:pPr>
+            <w:r>
+              <w:rPr>
+                <w:b/>
+                <w:bCs/>
+                <w:highlight w:val="yellow"/>
+                <w:highlightCs w:val="yellow"/>
+              </w:rPr>
+              <w:t xml:space="preserve">[TO DO: Insert blade loading, main blade and splitter, at 20 %, 50 % and 80 % span]</w:t>
+            </w:r>
+          </w:p>
+        </w:tc>
+      </w:tr>
+    </w:tbl>
+    <w:p>
+      <w:pPr>
+        <w:spacing w:after="240" w:before="60"/>
+        <w:jc w:val="center"/>
+      </w:pPr>
+      <w:r>
+        <w:rPr>
+          <w:i/>
+          <w:iCs/>
+          <w:color w:val="444444"/>
+          <w:sz w:val="20"/>
+          <w:szCs w:val="20"/>
+        </w:rPr>
+        <w:t xml:space="preserve">Figure 17. Blade loading, stage 2.</w:t>
+      </w:r>
+    </w:p>
+    <w:p>
+      <w:pPr>
+        <w:pStyle w:val="Heading2"/>
+        <w:spacing w:after="120" w:before="240"/>
+      </w:pPr>
+      <w:r>
+        <w:t xml:space="preserve">7.6  Mesh and convergence</w:t>
+      </w:r>
+    </w:p>
+    <w:p>
+      <w:pPr>
+        <w:spacing w:after="140" w:line="276"/>
+      </w:pPr>
+      <w:r>
+        <w:t xml:space="preserve">Average y⁺ is about 3 on the blades (maximum 71) and 27–52 on the hub, shroud and diffuser hub. The SST model's automatic wall treatment switches between resolving the near-wall layer and using wall functions, so both ranges are acceptable; the blades are close to resolved, the end walls use wall functions. RMS residuals flattened at about 10⁻⁴ (mass) and 4 × 10⁻⁴ (momentum) from about iteration 100 onward, without diverging, which points to mild unsteadiness from the tip vortex and the diffuser exit rather than a setup problem. The final mass and energy imbalances were −0.25 % and −0.30 %.</w:t>
+      </w:r>
+    </w:p>
+    <w:p>
+      <w:pPr>
+        <w:spacing w:after="80" w:before="200"/>
+      </w:pPr>
+      <w:r>
+        <w:rPr>
+          <w:b/>
+          <w:bCs/>
+          <w:sz w:val="20"/>
+          <w:szCs w:val="20"/>
+        </w:rPr>
+        <w:t xml:space="preserve">Table 12. Stage-2 limitations</w:t>
+      </w:r>
+    </w:p>
+    <w:tbl>
+      <w:tblPr>
+        <w:tblW w:type="dxa" w:w="9360"/>
+        <w:tblBorders>
+          <w:top w:val="single" w:color="auto" w:sz="4"/>
+          <w:left w:val="single" w:color="auto" w:sz="4"/>
+          <w:bottom w:val="single" w:color="auto" w:sz="4"/>
+          <w:right w:val="single" w:color="auto" w:sz="4"/>
+          <w:insideH w:val="single" w:color="auto" w:sz="4"/>
+          <w:insideV w:val="single" w:color="auto" w:sz="4"/>
+        </w:tblBorders>
+      </w:tblPr>
+      <w:tblGrid>
+        <w:gridCol w:w="4680"/>
+        <w:gridCol w:w="4680"/>
+      </w:tblGrid>
+      <w:tr>
+        <w:trPr>
+          <w:tblHeader/>
+        </w:trPr>
+        <w:tc>
+          <w:tcPr>
+            <w:tcW w:type="dxa" w:w="4680"/>
+            <w:tcBorders>
+              <w:top w:val="single" w:color="BFC7CE" w:sz="4"/>
+              <w:left w:val="single" w:color="BFC7CE" w:sz="4"/>
+              <w:bottom w:val="single" w:color="BFC7CE" w:sz="4"/>
+              <w:right w:val="single" w:color="BFC7CE" w:sz="4"/>
+            </w:tcBorders>
+            <w:shd w:fill="DCE6EC" w:color="auto" w:val="clear"/>
+            <w:tcMar>
+              <w:top w:type="dxa" w:w="60"/>
+              <w:left w:type="dxa" w:w="100"/>
+              <w:bottom w:type="dxa" w:w="60"/>
+              <w:right w:type="dxa" w:w="100"/>
+            </w:tcMar>
+          </w:tcPr>
+          <w:p>
+            <w:r>
+              <w:rPr>
+                <w:b/>
+                <w:bCs/>
+                <w:sz w:val="20"/>
+                <w:szCs w:val="20"/>
+              </w:rPr>
+              <w:t xml:space="preserve">Limitation</w:t>
+            </w:r>
+          </w:p>
+        </w:tc>
+        <w:tc>
+          <w:tcPr>
+            <w:tcW w:type="dxa" w:w="4680"/>
+            <w:tcBorders>
+              <w:top w:val="single" w:color="BFC7CE" w:sz="4"/>
+              <w:left w:val="single" w:color="BFC7CE" w:sz="4"/>
+              <w:bottom w:val="single" w:color="BFC7CE" w:sz="4"/>
+              <w:right w:val="single" w:color="BFC7CE" w:sz="4"/>
+            </w:tcBorders>
+            <w:shd w:fill="DCE6EC" w:color="auto" w:val="clear"/>
+            <w:tcMar>
+              <w:top w:type="dxa" w:w="60"/>
+              <w:left w:type="dxa" w:w="100"/>
+              <w:bottom w:type="dxa" w:w="60"/>
+              <w:right w:type="dxa" w:w="100"/>
+            </w:tcMar>
+          </w:tcPr>
+          <w:p>
+            <w:r>
+              <w:rPr>
+                <w:b/>
+                <w:bCs/>
+                <w:sz w:val="20"/>
+                <w:szCs w:val="20"/>
+              </w:rPr>
+              <w:t xml:space="preserve">Effect</w:t>
+            </w:r>
+          </w:p>
+        </w:tc>
+      </w:tr>
+      <w:tr>
+        <w:tc>
+          <w:tcPr>
+            <w:tcW w:type="dxa" w:w="4680"/>
+            <w:tcBorders>
+              <w:top w:val="single" w:color="BFC7CE" w:sz="4"/>
+              <w:left w:val="single" w:color="BFC7CE" w:sz="4"/>
+              <w:bottom w:val="single" w:color="BFC7CE" w:sz="4"/>
+              <w:right w:val="single" w:color="BFC7CE" w:sz="4"/>
+            </w:tcBorders>
+            <w:tcMar>
+              <w:top w:type="dxa" w:w="60"/>
+              <w:left w:type="dxa" w:w="100"/>
+              <w:bottom w:type="dxa" w:w="60"/>
+              <w:right w:type="dxa" w:w="100"/>
+            </w:tcMar>
+          </w:tcPr>
+          <w:p>
+            <w:r>
+              <w:rPr>
+                <w:b w:val="false"/>
+                <w:bCs w:val="false"/>
+                <w:sz w:val="20"/>
+                <w:szCs w:val="20"/>
+              </w:rPr>
+              <w:t xml:space="preserve">R-134a stand-in instead of R-513A</w:t>
+            </w:r>
+          </w:p>
+        </w:tc>
+        <w:tc>
+          <w:tcPr>
+            <w:tcW w:type="dxa" w:w="4680"/>
+            <w:tcBorders>
+              <w:top w:val="single" w:color="BFC7CE" w:sz="4"/>
+              <w:left w:val="single" w:color="BFC7CE" w:sz="4"/>
+              <w:bottom w:val="single" w:color="BFC7CE" w:sz="4"/>
+              <w:right w:val="single" w:color="BFC7CE" w:sz="4"/>
+            </w:tcBorders>
+            <w:tcMar>
+              <w:top w:type="dxa" w:w="60"/>
+              <w:left w:type="dxa" w:w="100"/>
+              <w:bottom w:type="dxa" w:w="60"/>
+              <w:right w:type="dxa" w:w="100"/>
+            </w:tcMar>
+          </w:tcPr>
+          <w:p>
+            <w:r>
+              <w:rPr>
+                <w:b w:val="false"/>
+                <w:bCs w:val="false"/>
+                <w:sz w:val="20"/>
+                <w:szCs w:val="20"/>
+              </w:rPr>
+              <w:t xml:space="preserve">Small property differences; same trends</w:t>
+            </w:r>
+          </w:p>
+        </w:tc>
+      </w:tr>
+      <w:tr>
+        <w:tc>
+          <w:tcPr>
+            <w:tcW w:type="dxa" w:w="4680"/>
+            <w:tcBorders>
+              <w:top w:val="single" w:color="BFC7CE" w:sz="4"/>
+              <w:left w:val="single" w:color="BFC7CE" w:sz="4"/>
+              <w:bottom w:val="single" w:color="BFC7CE" w:sz="4"/>
+              <w:right w:val="single" w:color="BFC7CE" w:sz="4"/>
+            </w:tcBorders>
+            <w:tcMar>
+              <w:top w:type="dxa" w:w="60"/>
+              <w:left w:type="dxa" w:w="100"/>
+              <w:bottom w:type="dxa" w:w="60"/>
+              <w:right w:type="dxa" w:w="100"/>
+            </w:tcMar>
+          </w:tcPr>
+          <w:p>
+            <w:r>
+              <w:rPr>
+                <w:b w:val="false"/>
+                <w:bCs w:val="false"/>
+                <w:sz w:val="20"/>
+                <w:szCs w:val="20"/>
+              </w:rPr>
+              <w:t xml:space="preserve">Single passage, steady, no volute or return channel</w:t>
+            </w:r>
+          </w:p>
+        </w:tc>
+        <w:tc>
+          <w:tcPr>
+            <w:tcW w:type="dxa" w:w="4680"/>
+            <w:tcBorders>
+              <w:top w:val="single" w:color="BFC7CE" w:sz="4"/>
+              <w:left w:val="single" w:color="BFC7CE" w:sz="4"/>
+              <w:bottom w:val="single" w:color="BFC7CE" w:sz="4"/>
+              <w:right w:val="single" w:color="BFC7CE" w:sz="4"/>
+            </w:tcBorders>
+            <w:tcMar>
+              <w:top w:type="dxa" w:w="60"/>
+              <w:left w:type="dxa" w:w="100"/>
+              <w:bottom w:type="dxa" w:w="60"/>
+              <w:right w:type="dxa" w:w="100"/>
+            </w:tcMar>
+          </w:tcPr>
+          <w:p>
+            <w:r>
+              <w:rPr>
+                <w:b w:val="false"/>
+                <w:bCs w:val="false"/>
+                <w:sz w:val="20"/>
+                <w:szCs w:val="20"/>
+              </w:rPr>
+              <w:t xml:space="preserve">Diffuser exit losses and non-uniformity not resolved downstream</w:t>
+            </w:r>
+          </w:p>
+        </w:tc>
+      </w:tr>
+      <w:tr>
+        <w:tc>
+          <w:tcPr>
+            <w:tcW w:type="dxa" w:w="4680"/>
+            <w:tcBorders>
+              <w:top w:val="single" w:color="BFC7CE" w:sz="4"/>
+              <w:left w:val="single" w:color="BFC7CE" w:sz="4"/>
+              <w:bottom w:val="single" w:color="BFC7CE" w:sz="4"/>
+              <w:right w:val="single" w:color="BFC7CE" w:sz="4"/>
+            </w:tcBorders>
+            <w:tcMar>
+              <w:top w:type="dxa" w:w="60"/>
+              <w:left w:type="dxa" w:w="100"/>
+              <w:bottom w:type="dxa" w:w="60"/>
+              <w:right w:type="dxa" w:w="100"/>
+            </w:tcMar>
+          </w:tcPr>
+          <w:p>
+            <w:r>
+              <w:rPr>
+                <w:b w:val="false"/>
+                <w:bCs w:val="false"/>
+                <w:sz w:val="20"/>
+                <w:szCs w:val="20"/>
+              </w:rPr>
+              <w:t xml:space="preserve">Outlet close to the impeller with 5.5 % reverse-flow area</w:t>
+            </w:r>
+          </w:p>
+        </w:tc>
+        <w:tc>
+          <w:tcPr>
+            <w:tcW w:type="dxa" w:w="4680"/>
+            <w:tcBorders>
+              <w:top w:val="single" w:color="BFC7CE" w:sz="4"/>
+              <w:left w:val="single" w:color="BFC7CE" w:sz="4"/>
+              <w:bottom w:val="single" w:color="BFC7CE" w:sz="4"/>
+              <w:right w:val="single" w:color="BFC7CE" w:sz="4"/>
+            </w:tcBorders>
+            <w:tcMar>
+              <w:top w:type="dxa" w:w="60"/>
+              <w:left w:type="dxa" w:w="100"/>
+              <w:bottom w:type="dxa" w:w="60"/>
+              <w:right w:type="dxa" w:w="100"/>
+            </w:tcMar>
+          </w:tcPr>
+          <w:p>
+            <w:r>
+              <w:rPr>
+                <w:b w:val="false"/>
+                <w:bCs w:val="false"/>
+                <w:sz w:val="20"/>
+                <w:szCs w:val="20"/>
+              </w:rPr>
+              <w:t xml:space="preserve">Averaged outlet totals uncertain; PR between 1.73 and 1.95</w:t>
+            </w:r>
+          </w:p>
+        </w:tc>
+      </w:tr>
+      <w:tr>
+        <w:tc>
+          <w:tcPr>
+            <w:tcW w:type="dxa" w:w="4680"/>
+            <w:tcBorders>
+              <w:top w:val="single" w:color="BFC7CE" w:sz="4"/>
+              <w:left w:val="single" w:color="BFC7CE" w:sz="4"/>
+              <w:bottom w:val="single" w:color="BFC7CE" w:sz="4"/>
+              <w:right w:val="single" w:color="BFC7CE" w:sz="4"/>
+            </w:tcBorders>
+            <w:tcMar>
+              <w:top w:type="dxa" w:w="60"/>
+              <w:left w:type="dxa" w:w="100"/>
+              <w:bottom w:type="dxa" w:w="60"/>
+              <w:right w:type="dxa" w:w="100"/>
+            </w:tcMar>
+          </w:tcPr>
+          <w:p>
+            <w:r>
+              <w:rPr>
+                <w:b w:val="false"/>
+                <w:bCs w:val="false"/>
+                <w:sz w:val="20"/>
+                <w:szCs w:val="20"/>
+              </w:rPr>
+              <w:t xml:space="preserve">No blade or hub fillets</w:t>
+            </w:r>
+          </w:p>
+        </w:tc>
+        <w:tc>
+          <w:tcPr>
+            <w:tcW w:type="dxa" w:w="4680"/>
+            <w:tcBorders>
+              <w:top w:val="single" w:color="BFC7CE" w:sz="4"/>
+              <w:left w:val="single" w:color="BFC7CE" w:sz="4"/>
+              <w:bottom w:val="single" w:color="BFC7CE" w:sz="4"/>
+              <w:right w:val="single" w:color="BFC7CE" w:sz="4"/>
+            </w:tcBorders>
+            <w:tcMar>
+              <w:top w:type="dxa" w:w="60"/>
+              <w:left w:type="dxa" w:w="100"/>
+              <w:bottom w:type="dxa" w:w="60"/>
+              <w:right w:type="dxa" w:w="100"/>
+            </w:tcMar>
+          </w:tcPr>
+          <w:p>
+            <w:r>
+              <w:rPr>
+                <w:b w:val="false"/>
+                <w:bCs w:val="false"/>
+                <w:sz w:val="20"/>
+                <w:szCs w:val="20"/>
+              </w:rPr>
+              <w:t xml:space="preserve">A few % extra blockage in the 4.2 mm exit passage not modelled</w:t>
+            </w:r>
+          </w:p>
+        </w:tc>
+      </w:tr>
+      <w:tr>
+        <w:tc>
+          <w:tcPr>
+            <w:tcW w:type="dxa" w:w="4680"/>
+            <w:tcBorders>
+              <w:top w:val="single" w:color="BFC7CE" w:sz="4"/>
+              <w:left w:val="single" w:color="BFC7CE" w:sz="4"/>
+              <w:bottom w:val="single" w:color="BFC7CE" w:sz="4"/>
+              <w:right w:val="single" w:color="BFC7CE" w:sz="4"/>
+            </w:tcBorders>
+            <w:tcMar>
+              <w:top w:type="dxa" w:w="60"/>
+              <w:left w:type="dxa" w:w="100"/>
+              <w:bottom w:type="dxa" w:w="60"/>
+              <w:right w:type="dxa" w:w="100"/>
+            </w:tcMar>
+          </w:tcPr>
+          <w:p>
+            <w:r>
+              <w:rPr>
+                <w:b w:val="false"/>
+                <w:bCs w:val="false"/>
+                <w:sz w:val="20"/>
+                <w:szCs w:val="20"/>
+              </w:rPr>
+              <w:t xml:space="preserve">Residuals plateaued near 10⁻⁴</w:t>
+            </w:r>
+          </w:p>
+        </w:tc>
+        <w:tc>
+          <w:tcPr>
+            <w:tcW w:type="dxa" w:w="4680"/>
+            <w:tcBorders>
+              <w:top w:val="single" w:color="BFC7CE" w:sz="4"/>
+              <w:left w:val="single" w:color="BFC7CE" w:sz="4"/>
+              <w:bottom w:val="single" w:color="BFC7CE" w:sz="4"/>
+              <w:right w:val="single" w:color="BFC7CE" w:sz="4"/>
+            </w:tcBorders>
+            <w:tcMar>
+              <w:top w:type="dxa" w:w="60"/>
+              <w:left w:type="dxa" w:w="100"/>
+              <w:bottom w:type="dxa" w:w="60"/>
+              <w:right w:type="dxa" w:w="100"/>
+            </w:tcMar>
+          </w:tcPr>
+          <w:p>
+            <w:r>
+              <w:rPr>
+                <w:b w:val="false"/>
+                <w:bCs w:val="false"/>
+                <w:sz w:val="20"/>
+                <w:szCs w:val="20"/>
+              </w:rPr>
+              <w:t xml:space="preserve">Averaged quantities steady to within about 1 %</w:t>
+            </w:r>
+          </w:p>
+        </w:tc>
+      </w:tr>
+    </w:tbl>
+    <w:p>
+      <w:pPr>
+        <w:pStyle w:val="Heading1"/>
+        <w:spacing w:after="160" w:before="360"/>
+      </w:pPr>
+      <w:r>
+        <w:t xml:space="preserve">8  Remaining work</w:t>
       </w:r>
     </w:p>
     <w:p>
@@ -7110,7 +9339,7 @@
         <w:spacing w:after="80"/>
       </w:pPr>
       <w:r>
-        <w:t xml:space="preserve">Design-point stage-1 run: 279.65 K inlet, 3.343 kg/s. Expected PR about 1.94 with R-134a properties.</w:t>
+        <w:t xml:space="preserve">Design-point stage-1 run: 279.65 K inlet (or 300 K with R-134a), 3.343 kg/s, with property-table generation and the same post-processing as stage 2.</w:t>
       </w:r>
     </w:p>
     <w:p>
@@ -7136,7 +9365,20 @@
         <w:spacing w:after="80"/>
       </w:pPr>
       <w:r>
-        <w:t xml:space="preserve">Stage-2 run and the combined two-stage pressure ratio.</w:t>
+        <w:t xml:space="preserve">Combined two-stage pressure ratio and power once the design-point stage-1 run is done.</w:t>
+      </w:r>
+    </w:p>
+    <w:p>
+      <w:pPr>
+        <w:pStyle w:val="ListParagraph"/>
+        <w:numPr>
+          <w:ilvl w:val="0"/>
+          <w:numId w:val="2"/>
+        </w:numPr>
+        <w:spacing w:after="80"/>
+      </w:pPr>
+      <w:r>
+        <w:t xml:space="preserve">Longer outlet domain for stage 2, to check whether the outlet reverse flow and the pressure-ratio averaging range shrink.</w:t>
       </w:r>
     </w:p>
     <w:p>

</xml_diff>